<commit_message>
Fix yield figure in blog: 33 percent → 19 percent (three occurrences)
</commit_message>
<xml_diff>
--- a/blog/blog_post_draft_all.docx
+++ b/blog/blog_post_draft_all.docx
@@ -33,7 +33,7 @@
           <w:i/>
           <w:iCs/>
         </w:rPr>
-        <w:t>Fertilizer recommendations based on a soil test, paired with a voucher worth $100, increased maize yields by about 33 percent in rural Malawi. But farmers used the voucher primarily to purchase more of the standard urea and NPK fertilizer bundle prescribed by the national subsidy program rather than the site-specific fertilizer blend prescribed by recommendations from the soil test.</w:t>
+        <w:t>Fertilizer recommendations based on a soil test, paired with a voucher worth $100, increased maize yields by about 19 percent in rural Malawi. But farmers used the voucher primarily to purchase more of the standard urea and NPK fertilizer bundle prescribed by the national subsidy program rather than the site-specific fertilizer blend prescribed by recommendations from the soil test.</w:t>
       </w:r>
     </w:p>
     <w:p>
@@ -138,7 +138,7 @@
         </w:numPr>
       </w:pPr>
       <w:r>
-        <w:t>The same recommendation paired with a $100 voucher raised fertilizer use on the targeted plot and lifted maize yields by about 33 percent.</w:t>
+        <w:t>The same recommendation paired with a $100 voucher raised fertilizer use on the targeted plot and lifted maize yields by about 19 percent.</w:t>
       </w:r>
     </w:p>
     <w:p>
@@ -319,7 +319,7 @@
         <w:jc w:val="both"/>
       </w:pPr>
       <w:r>
-        <w:t>On the soil-tested plot, voucher recipients applied roughly 30 kg more fertilizer than the comparison group and harvested about a third more maize. The productivity gain appears to be driven by the voucher intervention: the information arm by itself produced no such gain.</w:t>
+        <w:t>On the soil-tested plot, voucher recipients applied roughly 30 kg more fertilizer than the comparison group and harvested about 19 percent more maize. The productivity gain appears to be driven by the voucher intervention: the information arm by itself produced no such gain.</w:t>
       </w:r>
     </w:p>
     <w:p>

</xml_diff>

<commit_message>
Fix potassium share (70% → two-thirds) and remove unverified lime rate from blog
</commit_message>
<xml_diff>
--- a/blog/blog_post_draft_all.docx
+++ b/blog/blog_post_draft_all.docx
@@ -372,7 +372,7 @@
         </w:numPr>
       </w:pPr>
       <w:r>
-        <w:t>Potassium products (MOP, SOP, or potassium sulphate) were prescribed for around 70% of households in our sample. Application in the voucher arm was essentially zero, and lower than in the comparison group.</w:t>
+        <w:t>Potassium products (MOP, SOP, or potassium sulphate) were prescribed for roughly two-thirds of households in our sample. Application in the voucher arm was essentially zero, and lower than in the comparison group.</w:t>
       </w:r>
     </w:p>
     <w:p>
@@ -384,7 +384,7 @@
         </w:numPr>
       </w:pPr>
       <w:r>
-        <w:t>Lime was recommended for about a quarter of households, at roughly 950 kg per hectare. No household in any arm applied lime.</w:t>
+        <w:t>Lime was recommended for about a quarter of households. No household in any arm applied lime.</w:t>
       </w:r>
     </w:p>
     <w:p>

</xml_diff>

<commit_message>
Fix blog: affiliations (4 corrections), clarify 18+19 kg product-level note
</commit_message>
<xml_diff>
--- a/blog/blog_post_draft_all.docx
+++ b/blog/blog_post_draft_all.docx
@@ -332,7 +332,7 @@
       </w:r>
       <w:commentRangeStart w:id="7"/>
       <w:r>
-        <w:t xml:space="preserve"> The 30 kg increment is split almost evenly between urea (about 18 kg) and NPK 23:10:5 basal blend (about 19 kg).</w:t>
+        <w:t xml:space="preserve"> The voucher-induced additional fertilizer consists overwhelmingly of urea (about 18 kg) and NPK 23:10:5 basal blend (about 19 kg) — figures from product-level regressions that need not sum to the total.</w:t>
       </w:r>
       <w:commentRangeEnd w:id="7"/>
       <w:r>
@@ -602,7 +602,7 @@
         <w:jc w:val="both"/>
       </w:pPr>
       <w:r>
-        <w:t>*Thomas Assefa is with IFPRI’s Innovation Policy and Scaling Unit, based in Nairobi. Jonathan Atkinson is with Solidaridad, Johannesburg. Joachim De Weerdt is with IFPRI’s Development Strategy and Governance Division, based in Lilongwe. Edwin Siyame is with IFPRI’s Development Strategy and Governance Division, based in Lilongwe. David J. Spielman is with IFPRI’s Innovation Policy and Scaling Unit, based in Washington, DC. Hailemariam Ayalew is with IFPRI’s Development Strategies and Governance Unit, based in Nairobi. Bjorn Van Campenhout is with IFPRI’s Innovation Policy and Scaling Unit, based in Leuven. Opinions are the authors’.</w:t>
+        <w:t>*Thomas Assefa is with IFPRI’s Agrifood Innovation and Resilience Unit, based in Nairobi. Jonathan Atkinson is with Solidaridad Southern Africa, Johannesburg. Joachim De Weerdt is with IFPRI’s Development Strategy and Governance Division, based in Lilongwe. Edwin Siyame is with IFPRI’s Development Strategy and Governance Division, based in Lilongwe. David J. Spielman is with the School of Public Health, Washington University in St. Louis. Hailemariam Ayalew is with IFPRI’s Development Strategies and Governance Unit, based in Nairobi. Bjorn Van Campenhout is with IFPRI’s Markets, Trade, and Institutions Unit, based in Leuven. Opinions are the authors’.</w:t>
       </w:r>
       <w:bookmarkEnd w:id="1"/>
       <w:bookmarkEnd w:id="11"/>

</xml_diff>

<commit_message>
Condense key takeaways from 8 bullets to 5
</commit_message>
<xml_diff>
--- a/blog/blog_post_draft_all.docx
+++ b/blog/blog_post_draft_all.docx
@@ -126,7 +126,7 @@
         </w:numPr>
       </w:pPr>
       <w:r>
-        <w:t>Fertilizer recommendations based on a soil test, delivered on their own, produced no measurable change in fertilizer use, nutrient application, or maize yields among Malawian smallholders in a recent experiment.</w:t>
+        <w:t>Fertilizer recommendations based on a soil test, delivered on their own, produced no measurable change in fertilizer use, nutrient application, or maize yields among Malawian smallholders.</w:t>
       </w:r>
     </w:p>
     <w:p>
@@ -138,7 +138,7 @@
         </w:numPr>
       </w:pPr>
       <w:r>
-        <w:t>The same recommendation paired with a $100 voucher raised fertilizer use on the targeted plot and lifted maize yields by about 19 percent.</w:t>
+        <w:t>The same recommendation paired with a $100 voucher raised fertilizer use on the soil-tested plot and lifted maize yields by about 19 percent.</w:t>
       </w:r>
     </w:p>
     <w:p>
@@ -150,7 +150,7 @@
         </w:numPr>
       </w:pPr>
       <w:r>
-        <w:t>Voucher recipients used the money to purchase the standard bundle of urea and NPK recommended under the national subsidy program, and did not spend it on the lime, K, CAN, or MAP products prescribed by the recommendations from the soil test.</w:t>
+        <w:t>Voucher recipients spent the money on the standard urea and NPK bundle — the same products subsidized under the national programme — not on the lime, potassium, CAN, or MAP products their soil tests prescribed.</w:t>
       </w:r>
     </w:p>
     <w:p>
@@ -162,7 +162,7 @@
         </w:numPr>
       </w:pPr>
       <w:r>
-        <w:t xml:space="preserve">The experiment cannot identify why farmers ignored the precision blend. But the pattern is consistent with the presence of supply-side constraints—limited market availability of precision blend products, inappropriate package sizes and high products prices—alongside standard farmer-side constraints related to expectations, preferences, knowledge, and profitability. </w:t>
+        <w:t>Both supply-side constraints (limited availability of precision-blend products, large minimum package sizes) and demand-side constraints (farmer preferences, knowledge, profitability expectations) likely explain why the precision recommendation was ignored.</w:t>
       </w:r>
     </w:p>
     <w:p>
@@ -174,61 +174,7 @@
         </w:numPr>
       </w:pPr>
       <w:r>
-        <w:t>More broadly, results suggest that while interventions that combine information provision and financial services may influence productivity, they do not necessarily nudge farmer behavior toward precision farming practices.</w:t>
-      </w:r>
-    </w:p>
-    <w:p>
-      <w:pPr>
-        <w:pStyle w:val="Compact"/>
-        <w:numPr>
-          <w:ilvl w:val="0"/>
-          <w:numId w:val="2"/>
-        </w:numPr>
-      </w:pPr>
-      <w:r>
-        <w:t>The findings suggest that improving only one part of the agricultural value chain, information or finance, may not be sufficient to induce precision input use.</w:t>
-      </w:r>
-    </w:p>
-    <w:p>
-      <w:pPr>
-        <w:pStyle w:val="Compact"/>
-        <w:numPr>
-          <w:ilvl w:val="0"/>
-          <w:numId w:val="2"/>
-        </w:numPr>
-      </w:pPr>
-      <w:r>
-        <w:t>These results may potentially carry over to more sophisticated and more intensive information interventions. Examples include digital site-specific nutrient management decision support tools that combine remote sensing data with AI-</w:t>
-      </w:r>
-      <w:r>
-        <w:lastRenderedPageBreak/>
-        <w:t>powered advisories packaged in a smartphone app designed for use by smallholders.</w:t>
-      </w:r>
-    </w:p>
-    <w:p>
-      <w:pPr>
-        <w:pStyle w:val="Compact"/>
-        <w:numPr>
-          <w:ilvl w:val="0"/>
-          <w:numId w:val="2"/>
-        </w:numPr>
-      </w:pPr>
-      <w:r>
-        <w:t xml:space="preserve">Continued testing of the impact of these tools should remain a priority. </w:t>
-      </w:r>
-    </w:p>
-    <w:p>
-      <w:pPr>
-        <w:pStyle w:val="Compact"/>
-        <w:ind w:left="720"/>
-      </w:pPr>
-    </w:p>
-    <w:p>
-      <w:pPr>
-        <w:pStyle w:val="FirstParagraph"/>
-      </w:pPr>
-      <w:r>
-        <w:t>Africa’s input subsidy programs have been the subject of a long-running reform debate. One strand of this debate proposes shifting from one-size-fits-all fertilizer packages to site-specific ones adapted to local conditions. The agronomic case rests on the promise of precision agriculture: instead of every household receiving an identical fertilizer package regardless of what their soils need, each would receive a recommendation tailored to a soil test from its own plot, and use the voucher used to buy the specific products and quantities prescribed. The approach is expected to increase the efficiency of fertilizer use compared to universal programs, an objective that has become especially important as international fertilizer prices have risen substantially in recent years, raising the fiscal and economic costs of inefficient input use.</w:t>
+        <w:t>These results challenge the assumption that upgrading the information link of the agricultural value chain is sufficient to induce precision input use — a caveat that extends to AI-powered digital advisory tools.</w:t>
       </w:r>
     </w:p>
     <w:p>

</xml_diff>